<commit_message>
Agenda de reuniones con Google Calendar (videollamada y presencial)
- Modal accesible con pestañas Videollamada / Presencial que incrusta la
  página de reservas de Google Calendar (enlaces en lib/manifest.js)
- Sección "Agenda directa" en Contacto y botones "Agendar diagnóstico"
  en portada, recomendador y llamados finales
- Sin enlaces configurados, los botones llevan al formulario con la
  modalidad preseleccionada; campo "modalidad" en formulario y correo
- CSP: permite calendar.google.com en frame-src
- Manual Word y README actualizados

Co-Authored-By: Claude Opus 5.5 <noreply@anthropic.com>
Claude-Session: https://claude.ai/code/session_014HhWd9rVx2SndN6mx9n3rj
</commit_message>
<xml_diff>
--- a/docs/Manual_FUSE_Cloudflare.docx
+++ b/docs/Manual_FUSE_Cloudflare.docx
@@ -97,7 +97,7 @@
         <w:rPr>
           <w:color w:val="5B6475"/>
         </w:rPr>
-        <w:t xml:space="preserve">Versión 1.0 · 24 de septiembre de 2026</w:t>
+        <w:t xml:space="preserve">Versión 1.1 · 25 de septiembre de 2026</w:t>
       </w:r>
     </w:p>
     <w:p>
@@ -395,6 +395,26 @@
         <w:spacing w:after="80" w:line="288"/>
       </w:pPr>
       <w:r>
+        <w:rPr>
+          <w:b/>
+          <w:bCs/>
+        </w:rPr>
+        <w:t xml:space="preserve">Agenda de reuniones: </w:t>
+      </w:r>
+      <w:r>
+        <w:t xml:space="preserve">botón “Agendar diagnóstico” que abre tu Google Calendar dentro del sitio, con opción de videollamada o reunión presencial.</w:t>
+      </w:r>
+    </w:p>
+    <w:p>
+      <w:pPr>
+        <w:pStyle w:val="ListParagraph"/>
+        <w:numPr>
+          <w:ilvl w:val="0"/>
+          <w:numId w:val="2"/>
+        </w:numPr>
+        <w:spacing w:after="80" w:line="288"/>
+      </w:pPr>
+      <w:r>
         <w:t xml:space="preserve">Botón flotante de WhatsApp (aparece al cargar el número), botón “volver arriba”, sub-menú fijo en Servicios que marca la sección visible y menú móvil accesible (tecla Esc, bloqueo de scroll).</w:t>
       </w:r>
     </w:p>
@@ -2552,15 +2572,7 @@
         <w:pageBreakBefore/>
       </w:pPr>
       <w:r>
-        <w:t xml:space="preserve">7. Paso 5 — Analítica y posicionamiento</w:t>
-      </w:r>
-    </w:p>
-    <w:p>
-      <w:pPr>
-        <w:pStyle w:val="Heading2"/>
-      </w:pPr>
-      <w:r>
-        <w:t xml:space="preserve">7.1 Cloudflare Web Analytics (sin cookies)</w:t>
+        <w:t xml:space="preserve">7. Paso 5 — Agenda de reuniones con Google Calendar</w:t>
       </w:r>
     </w:p>
     <w:p>
@@ -2568,7 +2580,7 @@
         <w:spacing w:after="120" w:line="300"/>
       </w:pPr>
       <w:r>
-        <w:t xml:space="preserve">Pages → fuse → Metrics → Web Analytics → Enable. No usa cookies, por lo que no necesitas banner de consentimiento. Verás visitas, páginas más vistas, países y rendimiento (Core Web Vitals).</w:t>
+        <w:t xml:space="preserve">El botón “Agendar diagnóstico” (portada, recomendador, llamados finales y página de Contacto) abre un calendario donde el cliente elige día y hora. Hay dos modalidades: videollamada y presencial. Cada una es una “agenda de citas” distinta en Google Calendar.</w:t>
       </w:r>
     </w:p>
     <w:p>
@@ -2585,10 +2597,10 @@
           <w:bCs/>
           <w:color w:val="0057FF"/>
         </w:rPr>
-        <w:t xml:space="preserve">Si más adelante agregas Google Analytics 4 o Meta Pixel: </w:t>
-      </w:r>
-      <w:r>
-        <w:t xml:space="preserve">habrá que añadir sus dominios a la política de seguridad en _headers (Content-Security-Policy), un banner de cookies y actualizar la política de privacidad.</w:t>
+        <w:t xml:space="preserve">Mientras no configures nada: </w:t>
+      </w:r>
+      <w:r>
+        <w:t xml:space="preserve">los botones llevan al formulario con la modalidad ya marcada (Videollamada o Presencial), así que no se pierde ningún contacto.</w:t>
       </w:r>
     </w:p>
     <w:p>
@@ -2596,7 +2608,7 @@
         <w:pStyle w:val="Heading2"/>
       </w:pPr>
       <w:r>
-        <w:t xml:space="preserve">7.2 Google Search Console</w:t>
+        <w:t xml:space="preserve">7.1 Crear las dos agendas de citas</w:t>
       </w:r>
     </w:p>
     <w:p>
@@ -2609,7 +2621,7 @@
         <w:spacing w:after="90" w:line="288"/>
       </w:pPr>
       <w:r>
-        <w:t xml:space="preserve">search.google.com/search-console → Agregar propiedad → Dominio → fuseconsultora.com.</w:t>
+        <w:t xml:space="preserve">Entra a calendar.google.com con la cuenta que recibirá las reuniones.</w:t>
       </w:r>
     </w:p>
     <w:p>
@@ -2622,7 +2634,7 @@
         <w:spacing w:after="90" w:line="288"/>
       </w:pPr>
       <w:r>
-        <w:t xml:space="preserve">Google te da un registro TXT: agrégalo en Cloudflare → DNS y verifica.</w:t>
+        <w:t xml:space="preserve">Pulsa Crear → Agenda de citas (Appointment schedule).</w:t>
       </w:r>
     </w:p>
     <w:p>
@@ -2635,7 +2647,53 @@
         <w:spacing w:after="90" w:line="288"/>
       </w:pPr>
       <w:r>
-        <w:t xml:space="preserve">Sitemaps → escribe sitemap.xml → Enviar.</w:t>
+        <w:t xml:space="preserve">Título: “Diagnóstico FUSE — Videollamada”. Define la duración (ej. 30 min), los días y horarios disponibles y el margen entre citas.</w:t>
+      </w:r>
+    </w:p>
+    <w:p>
+      <w:pPr>
+        <w:pStyle w:val="ListParagraph"/>
+        <w:numPr>
+          <w:ilvl w:val="0"/>
+          <w:numId w:val="10"/>
+        </w:numPr>
+        <w:spacing w:after="90" w:line="288"/>
+      </w:pPr>
+      <w:r>
+        <w:t xml:space="preserve">En “Ubicación y conferencias” elige Google Meet. Guarda.</w:t>
+      </w:r>
+    </w:p>
+    <w:p>
+      <w:pPr>
+        <w:pStyle w:val="ListParagraph"/>
+        <w:numPr>
+          <w:ilvl w:val="0"/>
+          <w:numId w:val="10"/>
+        </w:numPr>
+        <w:spacing w:after="90" w:line="288"/>
+      </w:pPr>
+      <w:r>
+        <w:t xml:space="preserve">Repite para “Diagnóstico FUSE — Presencial”: en Ubicación elige “En persona” y escribe la dirección (o “En el negocio del cliente”). Guarda.</w:t>
+      </w:r>
+    </w:p>
+    <w:p>
+      <w:pPr>
+        <w:pBdr>
+          <w:left w:val="single" w:color="FF7A00" w:sz="24" w:space="8"/>
+        </w:pBdr>
+        <w:shd w:fill="FFF4EA" w:val="clear"/>
+        <w:spacing w:after="160" w:before="120" w:line="288"/>
+      </w:pPr>
+      <w:r>
+        <w:rPr>
+          <w:b/>
+          <w:bCs/>
+          <w:color w:val="FF7A00"/>
+        </w:rPr>
+        <w:t xml:space="preserve">Cuenta de Google: </w:t>
+      </w:r>
+      <w:r>
+        <w:t xml:space="preserve">con Gmail gratuito se pueden crear agendas de citas con funciones básicas. Algunas opciones avanzadas (varias agendas, recordatorios por correo, pedir verificación al cliente) pueden requerir Google Workspace o Google One Premium; si al crear la segunda agenda Google lo pide, usa una sola agenda y en su descripción indica que la reunión puede ser virtual o presencial.</w:t>
       </w:r>
     </w:p>
     <w:p>
@@ -2643,7 +2701,74 @@
         <w:pStyle w:val="Heading2"/>
       </w:pPr>
       <w:r>
-        <w:t xml:space="preserve">7.3 Google Business Profile</w:t>
+        <w:t xml:space="preserve">7.2 Copiar el enlace correcto</w:t>
+      </w:r>
+    </w:p>
+    <w:p>
+      <w:pPr>
+        <w:pStyle w:val="ListParagraph"/>
+        <w:numPr>
+          <w:ilvl w:val="0"/>
+          <w:numId w:val="11"/>
+        </w:numPr>
+        <w:spacing w:after="90" w:line="288"/>
+      </w:pPr>
+      <w:r>
+        <w:t xml:space="preserve">Abre la agenda de citas en tu calendario y pulsa Compartir (Share).</w:t>
+      </w:r>
+    </w:p>
+    <w:p>
+      <w:pPr>
+        <w:pStyle w:val="ListParagraph"/>
+        <w:numPr>
+          <w:ilvl w:val="0"/>
+          <w:numId w:val="11"/>
+        </w:numPr>
+        <w:spacing w:after="90" w:line="288"/>
+      </w:pPr>
+      <w:r>
+        <w:t xml:space="preserve">Elige “Insertar en el sitio web” (Website embed) → “Calendario de citas en línea” (Inline).</w:t>
+      </w:r>
+    </w:p>
+    <w:p>
+      <w:pPr>
+        <w:pStyle w:val="ListParagraph"/>
+        <w:numPr>
+          <w:ilvl w:val="0"/>
+          <w:numId w:val="11"/>
+        </w:numPr>
+        <w:spacing w:after="90" w:line="288"/>
+      </w:pPr>
+      <w:r>
+        <w:t xml:space="preserve">Del código que aparece copia solo la dirección que va entre comillas después de src=, que empieza con https://calendar.google.com/calendar/appointments/schedules/… y termina en ?gv=true.</w:t>
+      </w:r>
+    </w:p>
+    <w:p>
+      <w:pPr>
+        <w:pBdr>
+          <w:left w:val="single" w:color="FF7A00" w:sz="24" w:space="8"/>
+        </w:pBdr>
+        <w:shd w:fill="FFF4EA" w:val="clear"/>
+        <w:spacing w:after="160" w:before="120" w:line="288"/>
+      </w:pPr>
+      <w:r>
+        <w:rPr>
+          <w:b/>
+          <w:bCs/>
+          <w:color w:val="FF7A00"/>
+        </w:rPr>
+        <w:t xml:space="preserve">Ojo: </w:t>
+      </w:r>
+      <w:r>
+        <w:t xml:space="preserve">el enlace corto (calendar.app.google/…) también funciona, pero en ese caso el calendario se abre en una pestaña nueva en lugar de dentro del sitio. Para verlo integrado usa el enlace largo.</w:t>
+      </w:r>
+    </w:p>
+    <w:p>
+      <w:pPr>
+        <w:pStyle w:val="Heading2"/>
+      </w:pPr>
+      <w:r>
+        <w:t xml:space="preserve">7.3 Pegarlo en el sitio</w:t>
       </w:r>
     </w:p>
     <w:p>
@@ -2651,7 +2776,84 @@
         <w:spacing w:after="120" w:line="300"/>
       </w:pPr>
       <w:r>
-        <w:t xml:space="preserve">Para aparecer en búsquedas “agencia de marketing cerca de mí”, crea o reclama tu ficha en business.google.com, enlaza tu web y pide a cada cliente una reseña. Es coherente con lo que FUSE vende en SEO local.</w:t>
+        <w:t xml:space="preserve">En lib/manifest.js, sección booking:</w:t>
+      </w:r>
+    </w:p>
+    <w:p>
+      <w:pPr>
+        <w:pBdr>
+          <w:left w:val="single" w:color="0057FF" w:sz="18" w:space="6"/>
+        </w:pBdr>
+        <w:shd w:fill="F2F4F8" w:val="clear"/>
+        <w:spacing w:after="120"/>
+      </w:pPr>
+      <w:r>
+        <w:rPr>
+          <w:rFonts w:ascii="Consolas" w:cs="Consolas" w:eastAsia="Consolas" w:hAnsi="Consolas"/>
+          <w:sz w:val="19"/>
+          <w:szCs w:val="19"/>
+        </w:rPr>
+        <w:t xml:space="preserve">booking: {</w:t>
+      </w:r>
+      <w:r>
+        <w:br/>
+      </w:r>
+      <w:r>
+        <w:rPr>
+          <w:rFonts w:ascii="Consolas" w:cs="Consolas" w:eastAsia="Consolas" w:hAnsi="Consolas"/>
+          <w:sz w:val="19"/>
+          <w:szCs w:val="19"/>
+        </w:rPr>
+        <w:t xml:space="preserve">  virtualUrl: "https://calendar.google.com/calendar/appointments/schedules/AAAA…?gv=true",</w:t>
+      </w:r>
+      <w:r>
+        <w:br/>
+      </w:r>
+      <w:r>
+        <w:rPr>
+          <w:rFonts w:ascii="Consolas" w:cs="Consolas" w:eastAsia="Consolas" w:hAnsi="Consolas"/>
+          <w:sz w:val="19"/>
+          <w:szCs w:val="19"/>
+        </w:rPr>
+        <w:t xml:space="preserve">  presencialUrl: "https://calendar.google.com/calendar/appointments/schedules/BBBB…?gv=true",</w:t>
+      </w:r>
+      <w:r>
+        <w:br/>
+      </w:r>
+      <w:r>
+        <w:rPr>
+          <w:rFonts w:ascii="Consolas" w:cs="Consolas" w:eastAsia="Consolas" w:hAnsi="Consolas"/>
+          <w:sz w:val="19"/>
+          <w:szCs w:val="19"/>
+        </w:rPr>
+        <w:t xml:space="preserve">  ...</w:t>
+      </w:r>
+      <w:r>
+        <w:br/>
+      </w:r>
+      <w:r>
+        <w:rPr>
+          <w:rFonts w:ascii="Consolas" w:cs="Consolas" w:eastAsia="Consolas" w:hAnsi="Consolas"/>
+          <w:sz w:val="19"/>
+          <w:szCs w:val="19"/>
+        </w:rPr>
+        <w:t xml:space="preserve">}</w:t>
+      </w:r>
+    </w:p>
+    <w:p>
+      <w:pPr>
+        <w:spacing w:after="120" w:line="300"/>
+      </w:pPr>
+      <w:r>
+        <w:t xml:space="preserve">Si solo tienes una agenda, llena solo virtualUrl: el selector de modalidad se oculta automáticamente. Opcional: completa contact.meetAddress con la dirección de tus reuniones presenciales para mostrarla en Contacto.</w:t>
+      </w:r>
+    </w:p>
+    <w:p>
+      <w:pPr>
+        <w:spacing w:after="120" w:line="300"/>
+      </w:pPr>
+      <w:r>
+        <w:t xml:space="preserve">Guarda el cambio (commit) y en uno o dos minutos el calendario aparece en el sitio. Cada reserva llega a tu Google Calendar con aviso por correo y, si es virtual, con el enlace de Meet.</w:t>
       </w:r>
     </w:p>
     <w:p>
@@ -2660,7 +2862,115 @@
         <w:pageBreakBefore/>
       </w:pPr>
       <w:r>
-        <w:t xml:space="preserve">8. Uso diario: cómo editar el sitio</w:t>
+        <w:t xml:space="preserve">8. Paso 6 — Analítica y posicionamiento</w:t>
+      </w:r>
+    </w:p>
+    <w:p>
+      <w:pPr>
+        <w:pStyle w:val="Heading2"/>
+      </w:pPr>
+      <w:r>
+        <w:t xml:space="preserve">8.1 Cloudflare Web Analytics (sin cookies)</w:t>
+      </w:r>
+    </w:p>
+    <w:p>
+      <w:pPr>
+        <w:spacing w:after="120" w:line="300"/>
+      </w:pPr>
+      <w:r>
+        <w:t xml:space="preserve">Pages → fuse → Metrics → Web Analytics → Enable. No usa cookies, por lo que no necesitas banner de consentimiento. Verás visitas, páginas más vistas, países y rendimiento (Core Web Vitals).</w:t>
+      </w:r>
+    </w:p>
+    <w:p>
+      <w:pPr>
+        <w:pBdr>
+          <w:left w:val="single" w:color="0057FF" w:sz="24" w:space="8"/>
+        </w:pBdr>
+        <w:shd w:fill="EEF3FF" w:val="clear"/>
+        <w:spacing w:after="160" w:before="120" w:line="288"/>
+      </w:pPr>
+      <w:r>
+        <w:rPr>
+          <w:b/>
+          <w:bCs/>
+          <w:color w:val="0057FF"/>
+        </w:rPr>
+        <w:t xml:space="preserve">Si más adelante agregas Google Analytics 4 o Meta Pixel: </w:t>
+      </w:r>
+      <w:r>
+        <w:t xml:space="preserve">habrá que añadir sus dominios a la política de seguridad en _headers (Content-Security-Policy), un banner de cookies y actualizar la política de privacidad.</w:t>
+      </w:r>
+    </w:p>
+    <w:p>
+      <w:pPr>
+        <w:pStyle w:val="Heading2"/>
+      </w:pPr>
+      <w:r>
+        <w:t xml:space="preserve">8.2 Google Search Console</w:t>
+      </w:r>
+    </w:p>
+    <w:p>
+      <w:pPr>
+        <w:pStyle w:val="ListParagraph"/>
+        <w:numPr>
+          <w:ilvl w:val="0"/>
+          <w:numId w:val="12"/>
+        </w:numPr>
+        <w:spacing w:after="90" w:line="288"/>
+      </w:pPr>
+      <w:r>
+        <w:t xml:space="preserve">search.google.com/search-console → Agregar propiedad → Dominio → fuseconsultora.com.</w:t>
+      </w:r>
+    </w:p>
+    <w:p>
+      <w:pPr>
+        <w:pStyle w:val="ListParagraph"/>
+        <w:numPr>
+          <w:ilvl w:val="0"/>
+          <w:numId w:val="12"/>
+        </w:numPr>
+        <w:spacing w:after="90" w:line="288"/>
+      </w:pPr>
+      <w:r>
+        <w:t xml:space="preserve">Google te da un registro TXT: agrégalo en Cloudflare → DNS y verifica.</w:t>
+      </w:r>
+    </w:p>
+    <w:p>
+      <w:pPr>
+        <w:pStyle w:val="ListParagraph"/>
+        <w:numPr>
+          <w:ilvl w:val="0"/>
+          <w:numId w:val="12"/>
+        </w:numPr>
+        <w:spacing w:after="90" w:line="288"/>
+      </w:pPr>
+      <w:r>
+        <w:t xml:space="preserve">Sitemaps → escribe sitemap.xml → Enviar.</w:t>
+      </w:r>
+    </w:p>
+    <w:p>
+      <w:pPr>
+        <w:pStyle w:val="Heading2"/>
+      </w:pPr>
+      <w:r>
+        <w:t xml:space="preserve">8.3 Google Business Profile</w:t>
+      </w:r>
+    </w:p>
+    <w:p>
+      <w:pPr>
+        <w:spacing w:after="120" w:line="300"/>
+      </w:pPr>
+      <w:r>
+        <w:t xml:space="preserve">Para aparecer en búsquedas “agencia de marketing cerca de mí”, crea o reclama tu ficha en business.google.com, enlaza tu web y pide a cada cliente una reseña. Es coherente con lo que FUSE vende en SEO local.</w:t>
+      </w:r>
+    </w:p>
+    <w:p>
+      <w:pPr>
+        <w:pStyle w:val="Heading1"/>
+        <w:pageBreakBefore/>
+      </w:pPr>
+      <w:r>
+        <w:t xml:space="preserve">9. Uso diario: cómo editar el sitio</w:t>
       </w:r>
     </w:p>
     <w:p>
@@ -2851,7 +3161,7 @@
                 <w:sz w:val="19"/>
                 <w:szCs w:val="19"/>
               </w:rPr>
-              <w:t xml:space="preserve">Textos de una página</w:t>
+              <w:t xml:space="preserve">Enlaces de la agenda (Google Calendar)</w:t>
             </w:r>
           </w:p>
         </w:tc>
@@ -2881,7 +3191,7 @@
                 <w:sz w:val="19"/>
                 <w:szCs w:val="19"/>
               </w:rPr>
-              <w:t xml:space="preserve">El .html correspondiente</w:t>
+              <w:t xml:space="preserve">lib/manifest.js → booking</w:t>
             </w:r>
           </w:p>
         </w:tc>
@@ -2915,7 +3225,7 @@
                 <w:sz w:val="19"/>
                 <w:szCs w:val="19"/>
               </w:rPr>
-              <w:t xml:space="preserve">Testimonios</w:t>
+              <w:t xml:space="preserve">Textos de una página</w:t>
             </w:r>
           </w:p>
         </w:tc>
@@ -2944,7 +3254,7 @@
                 <w:sz w:val="19"/>
                 <w:szCs w:val="19"/>
               </w:rPr>
-              <w:t xml:space="preserve">index.html → sección TESTIMONIOS: cambia texto, nombre, rol y quita el badge “Ejemplo”</w:t>
+              <w:t xml:space="preserve">El .html correspondiente</w:t>
             </w:r>
           </w:p>
         </w:tc>
@@ -2979,7 +3289,7 @@
                 <w:sz w:val="19"/>
                 <w:szCs w:val="19"/>
               </w:rPr>
-              <w:t xml:space="preserve">Preguntas frecuentes</w:t>
+              <w:t xml:space="preserve">Testimonios</w:t>
             </w:r>
           </w:p>
         </w:tc>
@@ -3009,7 +3319,7 @@
                 <w:sz w:val="19"/>
                 <w:szCs w:val="19"/>
               </w:rPr>
-              <w:t xml:space="preserve">index.html / servicios.html → bloques &lt;details class="faq-item"&gt;</w:t>
+              <w:t xml:space="preserve">index.html → sección TESTIMONIOS: cambia texto, nombre, rol y quita el badge “Ejemplo”</w:t>
             </w:r>
           </w:p>
         </w:tc>
@@ -3043,7 +3353,7 @@
                 <w:sz w:val="19"/>
                 <w:szCs w:val="19"/>
               </w:rPr>
-              <w:t xml:space="preserve">Precios de paquetes</w:t>
+              <w:t xml:space="preserve">Preguntas frecuentes</w:t>
             </w:r>
           </w:p>
         </w:tc>
@@ -3072,7 +3382,7 @@
                 <w:sz w:val="19"/>
                 <w:szCs w:val="19"/>
               </w:rPr>
-              <w:t xml:space="preserve">servicios.html → “Cotización personalizada” en cada paquete</w:t>
+              <w:t xml:space="preserve">index.html / servicios.html → bloques &lt;details class="faq-item"&gt;</w:t>
             </w:r>
           </w:p>
         </w:tc>
@@ -3107,7 +3417,7 @@
                 <w:sz w:val="19"/>
                 <w:szCs w:val="19"/>
               </w:rPr>
-              <w:t xml:space="preserve">Colores de marca</w:t>
+              <w:t xml:space="preserve">Precios de paquetes</w:t>
             </w:r>
           </w:p>
         </w:tc>
@@ -3137,7 +3447,7 @@
                 <w:sz w:val="19"/>
                 <w:szCs w:val="19"/>
               </w:rPr>
-              <w:t xml:space="preserve">styles.css → primeras líneas (--blue, --orange, --violet…)</w:t>
+              <w:t xml:space="preserve">servicios.html → “Cotización personalizada” en cada paquete</w:t>
             </w:r>
           </w:p>
         </w:tc>
@@ -3171,7 +3481,7 @@
                 <w:sz w:val="19"/>
                 <w:szCs w:val="19"/>
               </w:rPr>
-              <w:t xml:space="preserve">Logo</w:t>
+              <w:t xml:space="preserve">Colores de marca</w:t>
             </w:r>
           </w:p>
         </w:tc>
@@ -3200,7 +3510,7 @@
                 <w:sz w:val="19"/>
                 <w:szCs w:val="19"/>
               </w:rPr>
-              <w:t xml:space="preserve">Reemplaza assets/img/logo-mark.svg y assets/favicon.svg con el mismo nombre</w:t>
+              <w:t xml:space="preserve">styles.css → primeras líneas (--blue, --orange, --violet…)</w:t>
             </w:r>
           </w:p>
         </w:tc>
@@ -3235,6 +3545,70 @@
                 <w:sz w:val="19"/>
                 <w:szCs w:val="19"/>
               </w:rPr>
+              <w:t xml:space="preserve">Logo</w:t>
+            </w:r>
+          </w:p>
+        </w:tc>
+        <w:tc>
+          <w:tcPr>
+            <w:tcW w:type="dxa" w:w="5726"/>
+            <w:tcBorders>
+              <w:top w:val="single" w:color="D5DAE3" w:sz="4"/>
+              <w:left w:val="single" w:color="D5DAE3" w:sz="4"/>
+              <w:bottom w:val="single" w:color="D5DAE3" w:sz="4"/>
+              <w:right w:val="single" w:color="D5DAE3" w:sz="4"/>
+            </w:tcBorders>
+            <w:shd w:fill="F7F8FB" w:val="clear"/>
+            <w:tcMar>
+              <w:top w:type="dxa" w:w="80"/>
+              <w:left w:type="dxa" w:w="110"/>
+              <w:bottom w:type="dxa" w:w="80"/>
+              <w:right w:type="dxa" w:w="110"/>
+            </w:tcMar>
+          </w:tcPr>
+          <w:p>
+            <w:pPr>
+              <w:spacing w:after="0" w:line="264"/>
+            </w:pPr>
+            <w:r>
+              <w:rPr>
+                <w:sz w:val="19"/>
+                <w:szCs w:val="19"/>
+              </w:rPr>
+              <w:t xml:space="preserve">Reemplaza assets/img/logo-mark.svg y assets/favicon.svg con el mismo nombre</w:t>
+            </w:r>
+          </w:p>
+        </w:tc>
+      </w:tr>
+      <w:tr>
+        <w:trPr>
+          <w:tblHeader w:val="false"/>
+        </w:trPr>
+        <w:tc>
+          <w:tcPr>
+            <w:tcW w:type="dxa" w:w="3300"/>
+            <w:tcBorders>
+              <w:top w:val="single" w:color="D5DAE3" w:sz="4"/>
+              <w:left w:val="single" w:color="D5DAE3" w:sz="4"/>
+              <w:bottom w:val="single" w:color="D5DAE3" w:sz="4"/>
+              <w:right w:val="single" w:color="D5DAE3" w:sz="4"/>
+            </w:tcBorders>
+            <w:tcMar>
+              <w:top w:type="dxa" w:w="80"/>
+              <w:left w:type="dxa" w:w="110"/>
+              <w:bottom w:type="dxa" w:w="80"/>
+              <w:right w:type="dxa" w:w="110"/>
+            </w:tcMar>
+          </w:tcPr>
+          <w:p>
+            <w:pPr>
+              <w:spacing w:after="0" w:line="264"/>
+            </w:pPr>
+            <w:r>
+              <w:rPr>
+                <w:sz w:val="19"/>
+                <w:szCs w:val="19"/>
+              </w:rPr>
               <w:t xml:space="preserve">Imagen al compartir en redes</w:t>
             </w:r>
           </w:p>
@@ -3248,7 +3622,6 @@
               <w:bottom w:val="single" w:color="D5DAE3" w:sz="4"/>
               <w:right w:val="single" w:color="D5DAE3" w:sz="4"/>
             </w:tcBorders>
-            <w:shd w:fill="F7F8FB" w:val="clear"/>
             <w:tcMar>
               <w:top w:type="dxa" w:w="80"/>
               <w:left w:type="dxa" w:w="110"/>
@@ -3304,7 +3677,7 @@
         <w:pStyle w:val="Heading2"/>
       </w:pPr>
       <w:r>
-        <w:t xml:space="preserve">8.1 Ejemplo: activar WhatsApp</w:t>
+        <w:t xml:space="preserve">9.1 Ejemplo: activar WhatsApp</w:t>
       </w:r>
     </w:p>
     <w:p>
@@ -3392,7 +3765,7 @@
         <w:pStyle w:val="Heading2"/>
       </w:pPr>
       <w:r>
-        <w:t xml:space="preserve">8.2 Volver a una versión anterior</w:t>
+        <w:t xml:space="preserve">9.2 Volver a una versión anterior</w:t>
       </w:r>
     </w:p>
     <w:p>
@@ -3408,7 +3781,7 @@
         <w:pStyle w:val="Heading2"/>
       </w:pPr>
       <w:r>
-        <w:t xml:space="preserve">8.3 Probar en tu computadora (opcional)</w:t>
+        <w:t xml:space="preserve">9.3 Probar en tu computadora (opcional)</w:t>
       </w:r>
     </w:p>
     <w:p>
@@ -3456,7 +3829,7 @@
         <w:pageBreakBefore/>
       </w:pPr>
       <w:r>
-        <w:t xml:space="preserve">9. Lista de verificación antes del lanzamiento</w:t>
+        <w:t xml:space="preserve">10. Lista de verificación antes del lanzamiento</w:t>
       </w:r>
     </w:p>
     <w:tbl>
@@ -4053,7 +4426,7 @@
                 <w:sz w:val="19"/>
                 <w:szCs w:val="19"/>
               </w:rPr>
-              <w:t xml:space="preserve">Testimonios de ejemplo reemplazados u ocultos</w:t>
+              <w:t xml:space="preserve">Agendas de citas de Google Calendar creadas y enlaces pegados en lib/manifest.js</w:t>
             </w:r>
           </w:p>
         </w:tc>
@@ -4116,7 +4489,7 @@
                 <w:sz w:val="19"/>
                 <w:szCs w:val="19"/>
               </w:rPr>
-              <w:t xml:space="preserve">Logo definitivo en alta resolución</w:t>
+              <w:t xml:space="preserve">Reserva de prueba hecha (virtual y presencial) y recibida en tu calendario</w:t>
             </w:r>
           </w:p>
         </w:tc>
@@ -4181,7 +4554,7 @@
                 <w:sz w:val="19"/>
                 <w:szCs w:val="19"/>
               </w:rPr>
-              <w:t xml:space="preserve">Política de privacidad revisada por un abogado</w:t>
+              <w:t xml:space="preserve">Testimonios de ejemplo reemplazados u ocultos</w:t>
             </w:r>
           </w:p>
         </w:tc>
@@ -4244,7 +4617,7 @@
                 <w:sz w:val="19"/>
                 <w:szCs w:val="19"/>
               </w:rPr>
-              <w:t xml:space="preserve">Web Analytics activado y sitemap enviado a Google Search Console</w:t>
+              <w:t xml:space="preserve">Logo definitivo en alta resolución</w:t>
             </w:r>
           </w:p>
         </w:tc>
@@ -4309,7 +4682,7 @@
                 <w:sz w:val="19"/>
                 <w:szCs w:val="19"/>
               </w:rPr>
-              <w:t xml:space="preserve">Prueba en celular: menú, formulario, WhatsApp y recomendador</w:t>
+              <w:t xml:space="preserve">Política de privacidad revisada por un abogado</w:t>
             </w:r>
           </w:p>
         </w:tc>
@@ -4372,6 +4745,134 @@
                 <w:sz w:val="19"/>
                 <w:szCs w:val="19"/>
               </w:rPr>
+              <w:t xml:space="preserve">Web Analytics activado y sitemap enviado a Google Search Console</w:t>
+            </w:r>
+          </w:p>
+        </w:tc>
+      </w:tr>
+      <w:tr>
+        <w:trPr>
+          <w:tblHeader w:val="false"/>
+        </w:trPr>
+        <w:tc>
+          <w:tcPr>
+            <w:tcW w:type="dxa" w:w="600"/>
+            <w:tcBorders>
+              <w:top w:val="single" w:color="D5DAE3" w:sz="4"/>
+              <w:left w:val="single" w:color="D5DAE3" w:sz="4"/>
+              <w:bottom w:val="single" w:color="D5DAE3" w:sz="4"/>
+              <w:right w:val="single" w:color="D5DAE3" w:sz="4"/>
+            </w:tcBorders>
+            <w:shd w:fill="F7F8FB" w:val="clear"/>
+            <w:tcMar>
+              <w:top w:type="dxa" w:w="80"/>
+              <w:left w:type="dxa" w:w="110"/>
+              <w:bottom w:type="dxa" w:w="80"/>
+              <w:right w:type="dxa" w:w="110"/>
+            </w:tcMar>
+          </w:tcPr>
+          <w:p>
+            <w:pPr>
+              <w:spacing w:after="0" w:line="264"/>
+            </w:pPr>
+            <w:r>
+              <w:rPr>
+                <w:sz w:val="19"/>
+                <w:szCs w:val="19"/>
+              </w:rPr>
+              <w:t xml:space="preserve">☐</w:t>
+            </w:r>
+          </w:p>
+        </w:tc>
+        <w:tc>
+          <w:tcPr>
+            <w:tcW w:type="dxa" w:w="8426"/>
+            <w:tcBorders>
+              <w:top w:val="single" w:color="D5DAE3" w:sz="4"/>
+              <w:left w:val="single" w:color="D5DAE3" w:sz="4"/>
+              <w:bottom w:val="single" w:color="D5DAE3" w:sz="4"/>
+              <w:right w:val="single" w:color="D5DAE3" w:sz="4"/>
+            </w:tcBorders>
+            <w:shd w:fill="F7F8FB" w:val="clear"/>
+            <w:tcMar>
+              <w:top w:type="dxa" w:w="80"/>
+              <w:left w:type="dxa" w:w="110"/>
+              <w:bottom w:type="dxa" w:w="80"/>
+              <w:right w:type="dxa" w:w="110"/>
+            </w:tcMar>
+          </w:tcPr>
+          <w:p>
+            <w:pPr>
+              <w:spacing w:after="0" w:line="264"/>
+            </w:pPr>
+            <w:r>
+              <w:rPr>
+                <w:sz w:val="19"/>
+                <w:szCs w:val="19"/>
+              </w:rPr>
+              <w:t xml:space="preserve">Prueba en celular: menú, formulario, WhatsApp y recomendador</w:t>
+            </w:r>
+          </w:p>
+        </w:tc>
+      </w:tr>
+      <w:tr>
+        <w:trPr>
+          <w:tblHeader w:val="false"/>
+        </w:trPr>
+        <w:tc>
+          <w:tcPr>
+            <w:tcW w:type="dxa" w:w="600"/>
+            <w:tcBorders>
+              <w:top w:val="single" w:color="D5DAE3" w:sz="4"/>
+              <w:left w:val="single" w:color="D5DAE3" w:sz="4"/>
+              <w:bottom w:val="single" w:color="D5DAE3" w:sz="4"/>
+              <w:right w:val="single" w:color="D5DAE3" w:sz="4"/>
+            </w:tcBorders>
+            <w:tcMar>
+              <w:top w:type="dxa" w:w="80"/>
+              <w:left w:type="dxa" w:w="110"/>
+              <w:bottom w:type="dxa" w:w="80"/>
+              <w:right w:type="dxa" w:w="110"/>
+            </w:tcMar>
+          </w:tcPr>
+          <w:p>
+            <w:pPr>
+              <w:spacing w:after="0" w:line="264"/>
+            </w:pPr>
+            <w:r>
+              <w:rPr>
+                <w:sz w:val="19"/>
+                <w:szCs w:val="19"/>
+              </w:rPr>
+              <w:t xml:space="preserve">☐</w:t>
+            </w:r>
+          </w:p>
+        </w:tc>
+        <w:tc>
+          <w:tcPr>
+            <w:tcW w:type="dxa" w:w="8426"/>
+            <w:tcBorders>
+              <w:top w:val="single" w:color="D5DAE3" w:sz="4"/>
+              <w:left w:val="single" w:color="D5DAE3" w:sz="4"/>
+              <w:bottom w:val="single" w:color="D5DAE3" w:sz="4"/>
+              <w:right w:val="single" w:color="D5DAE3" w:sz="4"/>
+            </w:tcBorders>
+            <w:tcMar>
+              <w:top w:type="dxa" w:w="80"/>
+              <w:left w:type="dxa" w:w="110"/>
+              <w:bottom w:type="dxa" w:w="80"/>
+              <w:right w:type="dxa" w:w="110"/>
+            </w:tcMar>
+          </w:tcPr>
+          <w:p>
+            <w:pPr>
+              <w:spacing w:after="0" w:line="264"/>
+            </w:pPr>
+            <w:r>
+              <w:rPr>
+                <w:sz w:val="19"/>
+                <w:szCs w:val="19"/>
+              </w:rPr>
               <w:t xml:space="preserve">Vista previa al compartir el enlace en WhatsApp/LinkedIn con la imagen correcta</w:t>
             </w:r>
           </w:p>
@@ -4384,7 +4885,7 @@
         <w:pageBreakBefore/>
       </w:pPr>
       <w:r>
-        <w:t xml:space="preserve">10. Solución de problemas</w:t>
+        <w:t xml:space="preserve">11. Solución de problemas</w:t>
       </w:r>
     </w:p>
     <w:tbl>
@@ -4887,6 +5388,70 @@
                 <w:sz w:val="19"/>
                 <w:szCs w:val="19"/>
               </w:rPr>
+              <w:t xml:space="preserve">El calendario no aparece dentro del sitio</w:t>
+            </w:r>
+          </w:p>
+        </w:tc>
+        <w:tc>
+          <w:tcPr>
+            <w:tcW w:type="dxa" w:w="5826"/>
+            <w:tcBorders>
+              <w:top w:val="single" w:color="D5DAE3" w:sz="4"/>
+              <w:left w:val="single" w:color="D5DAE3" w:sz="4"/>
+              <w:bottom w:val="single" w:color="D5DAE3" w:sz="4"/>
+              <w:right w:val="single" w:color="D5DAE3" w:sz="4"/>
+            </w:tcBorders>
+            <w:tcMar>
+              <w:top w:type="dxa" w:w="80"/>
+              <w:left w:type="dxa" w:w="110"/>
+              <w:bottom w:type="dxa" w:w="80"/>
+              <w:right w:type="dxa" w:w="110"/>
+            </w:tcMar>
+          </w:tcPr>
+          <w:p>
+            <w:pPr>
+              <w:spacing w:after="0" w:line="264"/>
+            </w:pPr>
+            <w:r>
+              <w:rPr>
+                <w:sz w:val="19"/>
+                <w:szCs w:val="19"/>
+              </w:rPr>
+              <w:t xml:space="preserve">Usa el enlace largo que termina en ?gv=true (sección 7.2). Con el enlace corto se abre en pestaña nueva.</w:t>
+            </w:r>
+          </w:p>
+        </w:tc>
+      </w:tr>
+      <w:tr>
+        <w:trPr>
+          <w:tblHeader w:val="false"/>
+        </w:trPr>
+        <w:tc>
+          <w:tcPr>
+            <w:tcW w:type="dxa" w:w="3200"/>
+            <w:tcBorders>
+              <w:top w:val="single" w:color="D5DAE3" w:sz="4"/>
+              <w:left w:val="single" w:color="D5DAE3" w:sz="4"/>
+              <w:bottom w:val="single" w:color="D5DAE3" w:sz="4"/>
+              <w:right w:val="single" w:color="D5DAE3" w:sz="4"/>
+            </w:tcBorders>
+            <w:shd w:fill="F7F8FB" w:val="clear"/>
+            <w:tcMar>
+              <w:top w:type="dxa" w:w="80"/>
+              <w:left w:type="dxa" w:w="110"/>
+              <w:bottom w:type="dxa" w:w="80"/>
+              <w:right w:type="dxa" w:w="110"/>
+            </w:tcMar>
+          </w:tcPr>
+          <w:p>
+            <w:pPr>
+              <w:spacing w:after="0" w:line="264"/>
+            </w:pPr>
+            <w:r>
+              <w:rPr>
+                <w:sz w:val="19"/>
+                <w:szCs w:val="19"/>
+              </w:rPr>
               <w:t xml:space="preserve">La revisión de GitHub sale en rojo</w:t>
             </w:r>
           </w:p>
@@ -4900,6 +5465,7 @@
               <w:bottom w:val="single" w:color="D5DAE3" w:sz="4"/>
               <w:right w:val="single" w:color="D5DAE3" w:sz="4"/>
             </w:tcBorders>
+            <w:shd w:fill="F7F8FB" w:val="clear"/>
             <w:tcMar>
               <w:top w:type="dxa" w:w="80"/>
               <w:left w:type="dxa" w:w="110"/>
@@ -4928,7 +5494,7 @@
         <w:pageBreakBefore/>
       </w:pPr>
       <w:r>
-        <w:t xml:space="preserve">11. Preguntas para seguir mejorando el sitio</w:t>
+        <w:t xml:space="preserve">12. Preguntas para seguir mejorando el sitio</w:t>
       </w:r>
     </w:p>
     <w:p>
@@ -5412,7 +5978,7 @@
         <w:t xml:space="preserve">16. </w:t>
       </w:r>
       <w:r>
-        <w:t xml:space="preserve">¿Quieres que el visitante pueda agendar directamente la llamada de diagnóstico (Calendly o Cal.com integrado)?</w:t>
+        <w:t xml:space="preserve">¿Cuánto dura la reunión de diagnóstico y en qué horarios atiendes? ¿Las presenciales son en tu oficina o en el negocio del cliente?</w:t>
       </w:r>
     </w:p>
     <w:p>
@@ -5905,7 +6471,7 @@
         <w:pageBreakBefore/>
       </w:pPr>
       <w:r>
-        <w:t xml:space="preserve">12. Anexo: estructura de archivos</w:t>
+        <w:t xml:space="preserve">13. Anexo: estructura de archivos</w:t>
       </w:r>
     </w:p>
     <w:p>
@@ -6760,6 +7326,18 @@
   </w:num>
   <w:num w:numId="10">
     <w:abstractNumId w:val="10"/>
+    <w:lvlOverride w:ilvl="0">
+      <w:startOverride w:val="1"/>
+    </w:lvlOverride>
+  </w:num>
+  <w:num w:numId="11">
+    <w:abstractNumId w:val="11"/>
+    <w:lvlOverride w:ilvl="0">
+      <w:startOverride w:val="1"/>
+    </w:lvlOverride>
+  </w:num>
+  <w:num w:numId="12">
+    <w:abstractNumId w:val="12"/>
     <w:lvlOverride w:ilvl="0">
       <w:startOverride w:val="1"/>
     </w:lvlOverride>

</xml_diff>

<commit_message>
Cargar WhatsApp real y reunión presencial "a convenir"
- WhatsApp +53 5 152 9640: botón flotante, bloque en Contacto y pie
- Reunión presencial en el lugar que se acuerde (negocio, oficina o punto
  de encuentro)
- Política de privacidad: referencia a la Ley 149/2022 de Cuba
- Manual actualizado

Co-Authored-By: Claude Opus 5.5 <noreply@anthropic.com>
Claude-Session: https://claude.ai/code/session_014HhWd9rVx2SndN6mx9n3rj
</commit_message>
<xml_diff>
--- a/docs/Manual_FUSE_Cloudflare.docx
+++ b/docs/Manual_FUSE_Cloudflare.docx
@@ -3677,7 +3677,7 @@
         <w:pStyle w:val="Heading2"/>
       </w:pPr>
       <w:r>
-        <w:t xml:space="preserve">9.1 Ejemplo: activar WhatsApp</w:t>
+        <w:t xml:space="preserve">9.1 Ejemplo: datos de WhatsApp (ya cargados)</w:t>
       </w:r>
     </w:p>
     <w:p>
@@ -3716,7 +3716,7 @@
           <w:sz w:val="19"/>
           <w:szCs w:val="19"/>
         </w:rPr>
-        <w:t xml:space="preserve">  phone: "+52 55 1234 5678",</w:t>
+        <w:t xml:space="preserve">  whatsapp: "5351529640",            // solo números, con código de país</w:t>
       </w:r>
       <w:r>
         <w:br/>
@@ -3727,7 +3727,7 @@
           <w:sz w:val="19"/>
           <w:szCs w:val="19"/>
         </w:rPr>
-        <w:t xml:space="preserve">  whatsapp: "5215512345678",   // solo números, con código de país</w:t>
+        <w:t xml:space="preserve">  whatsappLabel: "+53 5 152 9640",   // cómo se ve en el sitio</w:t>
       </w:r>
       <w:r>
         <w:br/>
@@ -3738,7 +3738,7 @@
           <w:sz w:val="19"/>
           <w:szCs w:val="19"/>
         </w:rPr>
-        <w:t xml:space="preserve">  city: "Ciudad de México, México",</w:t>
+        <w:t xml:space="preserve">  city: "",                          // ej. "La Habana, Cuba"</w:t>
       </w:r>
       <w:r>
         <w:br/>
@@ -3757,7 +3757,7 @@
         <w:spacing w:after="120" w:line="300"/>
       </w:pPr>
       <w:r>
-        <w:t xml:space="preserve">Al guardar, aparece el botón verde flotante en todas las páginas y el bloque de WhatsApp en Contacto.</w:t>
+        <w:t xml:space="preserve">El botón verde flotante ya aparece en todas las páginas y el número se muestra en Contacto y en el pie de página. Para cambiarlo, edita esos dos campos.</w:t>
       </w:r>
     </w:p>
     <w:p>
@@ -5614,7 +5614,7 @@
         <w:t xml:space="preserve">4. </w:t>
       </w:r>
       <w:r>
-        <w:t xml:space="preserve">¿Tienes un número de WhatsApp Business para el botón flotante? ¿Y teléfono fijo?</w:t>
+        <w:t xml:space="preserve">¿El WhatsApp +53 5 152 9640 es también tu teléfono de llamadas? ¿Tienes teléfono fijo?</w:t>
       </w:r>
     </w:p>
     <w:p>

</xml_diff>

<commit_message>
Tipografías propias, agendar por WhatsApp y modo liviano
- Inter y Montserrat alojadas en assets/fonts (woff2 latin/latin-ext):
  sin peticiones a Google Fonts; CSP más estricta (font-src 'self')
- Agenda: tercera vía "coordinar por WhatsApp" con mensaje prellenado
  (en Contacto y dentro del modal)
- Modo liviano automático con ahorro de datos o conexión 2G/3G
- Privacidad y manual actualizados

Co-Authored-By: Claude Opus 5.5 <noreply@anthropic.com>
Claude-Session: https://claude.ai/code/session_014HhWd9rVx2SndN6mx9n3rj
</commit_message>
<xml_diff>
--- a/docs/Manual_FUSE_Cloudflare.docx
+++ b/docs/Manual_FUSE_Cloudflare.docx
@@ -462,6 +462,32 @@
         <w:spacing w:after="80" w:line="288"/>
       </w:pPr>
       <w:r>
+        <w:t xml:space="preserve">Tipografías alojadas en el propio sitio (sin Google Fonts): carga más rápida y el sitio no hace ninguna petición a servicios externos para mostrarse.</w:t>
+      </w:r>
+    </w:p>
+    <w:p>
+      <w:pPr>
+        <w:pStyle w:val="ListParagraph"/>
+        <w:numPr>
+          <w:ilvl w:val="0"/>
+          <w:numId w:val="2"/>
+        </w:numPr>
+        <w:spacing w:after="80" w:line="288"/>
+      </w:pPr>
+      <w:r>
+        <w:t xml:space="preserve">Modo liviano automático: con “ahorro de datos” o conexión lenta (2G/3G) se desactivan desenfoques y animaciones continuas. Pensado para visitantes con conexión limitada, por ejemplo en Cuba.</w:t>
+      </w:r>
+    </w:p>
+    <w:p>
+      <w:pPr>
+        <w:pStyle w:val="ListParagraph"/>
+        <w:numPr>
+          <w:ilvl w:val="0"/>
+          <w:numId w:val="2"/>
+        </w:numPr>
+        <w:spacing w:after="80" w:line="288"/>
+      </w:pPr>
+      <w:r>
         <w:t xml:space="preserve">Íconos PNG para iPhone/Android y manifest para “añadir a pantalla de inicio”.</w:t>
       </w:r>
     </w:p>
@@ -2581,6 +2607,14 @@
       </w:pPr>
       <w:r>
         <w:t xml:space="preserve">El botón “Agendar diagnóstico” (portada, recomendador, llamados finales y página de Contacto) abre un calendario donde el cliente elige día y hora. Hay dos modalidades: videollamada y presencial. Cada una es una “agenda de citas” distinta en Google Calendar.</w:t>
+      </w:r>
+    </w:p>
+    <w:p>
+      <w:pPr>
+        <w:spacing w:after="120" w:line="300"/>
+      </w:pPr>
+      <w:r>
+        <w:t xml:space="preserve">Además, debajo de las dos opciones aparece “¿Prefieres coordinar por WhatsApp?”, que abre un chat con un mensaje listo para pedir día y hora. Es la vía más cómoda para clientes con conexión inestable o donde Google Calendar/Meet no funciona bien. El texto del mensaje se cambia en lib/manifest.js → whatsappBookingMessage.</w:t>
       </w:r>
     </w:p>
     <w:p>

</xml_diff>

<commit_message>
Email opcional con plan B por WhatsApp y testimonios ocultos
- Sin email en el manifest: se oculta en todo el sitio y el formulario
  envía el mensaje por WhatsApp (con todos los datos) como plan B
- La función solo envía correo si hay RESEND_API_KEY y CONTACT_TO
- Política de privacidad: contacto por WhatsApp / página de contacto
- Testimonios de ejemplo ocultos hasta tener reseñas reales
- JSON-LD: contactPoint con WhatsApp en lugar de email
- Manual: cómo activar el email más adelante (Email Routing + CONTACT_TO)

Co-Authored-By: Claude Opus 5.5 <noreply@anthropic.com>
Claude-Session: https://claude.ai/code/session_014HhWd9rVx2SndN6mx9n3rj
</commit_message>
<xml_diff>
--- a/docs/Manual_FUSE_Cloudflare.docx
+++ b/docs/Manual_FUSE_Cloudflare.docx
@@ -342,7 +342,7 @@
         <w:t xml:space="preserve">Formulario con envío real </w:t>
       </w:r>
       <w:r>
-        <w:t xml:space="preserve">mediante una función de Cloudflare (functions/api/contact.js): valida datos, filtra spam (campo trampa, Turnstile opcional, límite por IP) y envía el correo con Resend. Si aún no está configurado, abre el correo del visitante como plan B.</w:t>
+        <w:t xml:space="preserve">mediante una función de Cloudflare (functions/api/contact.js): valida datos, filtra spam (campo trampa, Turnstile opcional, límite por IP) y envía el correo con Resend. Si aún no está configurado, envía el mensaje por WhatsApp como plan B.</w:t>
       </w:r>
     </w:p>
     <w:p>
@@ -1866,7 +1866,7 @@
         <w:spacing w:after="120" w:line="300"/>
       </w:pPr>
       <w:r>
-        <w:t xml:space="preserve">Sin este paso, el formulario abre el correo del visitante (funciona, pero es menos cómodo). Con este paso, el mensaje llega directo a tu bandeja sin que el visitante salga del sitio.</w:t>
+        <w:t xml:space="preserve">Hoy el sitio no muestra ningún email (lo decidiste así). Mientras tanto el formulario funciona igual: al enviarlo, abre WhatsApp con todos los datos del cliente ya escritos, listos para mandar a tu número. Cuando quieras recibir los mensajes por correo, sigue estos pasos.</w:t>
       </w:r>
     </w:p>
     <w:p>
@@ -1874,7 +1874,7 @@
         <w:pStyle w:val="Heading2"/>
       </w:pPr>
       <w:r>
-        <w:t xml:space="preserve">6.1 Crear la cuenta de envío en Resend</w:t>
+        <w:t xml:space="preserve">6.0 Activar tu email (cuando quieras)</w:t>
       </w:r>
     </w:p>
     <w:p>
@@ -1887,7 +1887,7 @@
         <w:spacing w:after="90" w:line="288"/>
       </w:pPr>
       <w:r>
-        <w:t xml:space="preserve">Crea una cuenta en resend.com.</w:t>
+        <w:t xml:space="preserve">Decide la dirección. Recomendado: una con tu dominio, ej. hola@fuseconsultora.com.</w:t>
       </w:r>
     </w:p>
     <w:p>
@@ -1900,7 +1900,7 @@
         <w:spacing w:after="90" w:line="288"/>
       </w:pPr>
       <w:r>
-        <w:t xml:space="preserve">Domains → Add Domain → fuseconsultora.com. Resend te muestra 3–4 registros DNS (SPF, DKIM).</w:t>
+        <w:t xml:space="preserve">Para crearla gratis: Cloudflare → tu dominio → Email → Email Routing → Enable. Crea la dirección hola@ y elige a qué correo personal se reenvía (Gmail, Outlook…). Confirma el correo de verificación.</w:t>
       </w:r>
     </w:p>
     <w:p>
@@ -1913,7 +1913,7 @@
         <w:spacing w:after="90" w:line="288"/>
       </w:pPr>
       <w:r>
-        <w:t xml:space="preserve">Cópialos en Cloudflare → tu dominio → DNS → Records → Add record (tipo, nombre y valor exactamente iguales; en los TXT/MX deja la nube gris “DNS only”).</w:t>
+        <w:t xml:space="preserve">En lib/manifest.js escribe la dirección en contact.email. Aparece sola en Contacto, en el pie de página y en la política de privacidad.</w:t>
       </w:r>
     </w:p>
     <w:p>
@@ -1926,7 +1926,15 @@
         <w:spacing w:after="90" w:line="288"/>
       </w:pPr>
       <w:r>
-        <w:t xml:space="preserve">Vuelve a Resend y pulsa Verify. Suele tardar pocos minutos.</w:t>
+        <w:t xml:space="preserve">En Cloudflare Pages agrega la variable CONTACT_TO con esa misma dirección (sección 6.2) para que el formulario te la envíe.</w:t>
+      </w:r>
+    </w:p>
+    <w:p>
+      <w:pPr>
+        <w:pStyle w:val="Heading2"/>
+      </w:pPr>
+      <w:r>
+        <w:t xml:space="preserve">6.1 Crear la cuenta de envío en Resend</w:t>
       </w:r>
     </w:p>
     <w:p>
@@ -1934,7 +1942,59 @@
         <w:pStyle w:val="ListParagraph"/>
         <w:numPr>
           <w:ilvl w:val="0"/>
-          <w:numId w:val="7"/>
+          <w:numId w:val="8"/>
+        </w:numPr>
+        <w:spacing w:after="90" w:line="288"/>
+      </w:pPr>
+      <w:r>
+        <w:t xml:space="preserve">Crea una cuenta en resend.com.</w:t>
+      </w:r>
+    </w:p>
+    <w:p>
+      <w:pPr>
+        <w:pStyle w:val="ListParagraph"/>
+        <w:numPr>
+          <w:ilvl w:val="0"/>
+          <w:numId w:val="8"/>
+        </w:numPr>
+        <w:spacing w:after="90" w:line="288"/>
+      </w:pPr>
+      <w:r>
+        <w:t xml:space="preserve">Domains → Add Domain → fuseconsultora.com. Resend te muestra 3–4 registros DNS (SPF, DKIM).</w:t>
+      </w:r>
+    </w:p>
+    <w:p>
+      <w:pPr>
+        <w:pStyle w:val="ListParagraph"/>
+        <w:numPr>
+          <w:ilvl w:val="0"/>
+          <w:numId w:val="8"/>
+        </w:numPr>
+        <w:spacing w:after="90" w:line="288"/>
+      </w:pPr>
+      <w:r>
+        <w:t xml:space="preserve">Cópialos en Cloudflare → tu dominio → DNS → Records → Add record (tipo, nombre y valor exactamente iguales; en los TXT/MX deja la nube gris “DNS only”).</w:t>
+      </w:r>
+    </w:p>
+    <w:p>
+      <w:pPr>
+        <w:pStyle w:val="ListParagraph"/>
+        <w:numPr>
+          <w:ilvl w:val="0"/>
+          <w:numId w:val="8"/>
+        </w:numPr>
+        <w:spacing w:after="90" w:line="288"/>
+      </w:pPr>
+      <w:r>
+        <w:t xml:space="preserve">Vuelve a Resend y pulsa Verify. Suele tardar pocos minutos.</w:t>
+      </w:r>
+    </w:p>
+    <w:p>
+      <w:pPr>
+        <w:pStyle w:val="ListParagraph"/>
+        <w:numPr>
+          <w:ilvl w:val="0"/>
+          <w:numId w:val="8"/>
         </w:numPr>
         <w:spacing w:after="90" w:line="288"/>
       </w:pPr>
@@ -2261,7 +2321,7 @@
                 <w:sz w:val="19"/>
                 <w:szCs w:val="19"/>
               </w:rPr>
-              <w:t xml:space="preserve">hola@fuseconsultora.com (varias: separa con comas)</w:t>
+              <w:t xml:space="preserve">hola@fuseconsultora.com (obligatoria; varias: separa con comas)</w:t>
             </w:r>
           </w:p>
         </w:tc>
@@ -2488,53 +2548,6 @@
       </w:pPr>
       <w:r>
         <w:t xml:space="preserve">6.3 Probar</w:t>
-      </w:r>
-    </w:p>
-    <w:p>
-      <w:pPr>
-        <w:pStyle w:val="ListParagraph"/>
-        <w:numPr>
-          <w:ilvl w:val="0"/>
-          <w:numId w:val="8"/>
-        </w:numPr>
-        <w:spacing w:after="90" w:line="288"/>
-      </w:pPr>
-      <w:r>
-        <w:t xml:space="preserve">Abre /contacto en tu dominio, completa el formulario y envía.</w:t>
-      </w:r>
-    </w:p>
-    <w:p>
-      <w:pPr>
-        <w:pStyle w:val="ListParagraph"/>
-        <w:numPr>
-          <w:ilvl w:val="0"/>
-          <w:numId w:val="8"/>
-        </w:numPr>
-        <w:spacing w:after="90" w:line="288"/>
-      </w:pPr>
-      <w:r>
-        <w:t xml:space="preserve">Debe aparecer el aviso verde “¡Mensaje recibido!” y llegar un correo con todos los datos. Si respondes a ese correo, la respuesta va directo al cliente.</w:t>
-      </w:r>
-    </w:p>
-    <w:p>
-      <w:pPr>
-        <w:pStyle w:val="ListParagraph"/>
-        <w:numPr>
-          <w:ilvl w:val="0"/>
-          <w:numId w:val="8"/>
-        </w:numPr>
-        <w:spacing w:after="90" w:line="288"/>
-      </w:pPr>
-      <w:r>
-        <w:t xml:space="preserve">Si falla: Workers &amp; Pages → fuse → Deployments → View details → Functions → Real-time logs muestra el error exacto.</w:t>
-      </w:r>
-    </w:p>
-    <w:p>
-      <w:pPr>
-        <w:pStyle w:val="Heading2"/>
-      </w:pPr>
-      <w:r>
-        <w:t xml:space="preserve">6.4 Anti-spam con Turnstile (recomendado)</w:t>
       </w:r>
     </w:p>
     <w:p>
@@ -2547,7 +2560,7 @@
         <w:spacing w:after="90" w:line="288"/>
       </w:pPr>
       <w:r>
-        <w:t xml:space="preserve">Cloudflare → Turnstile → Add widget. Nombre: FUSE web · Hostnames: tu dominio y fuse.pages.dev · Modo: Managed.</w:t>
+        <w:t xml:space="preserve">Abre /contacto en tu dominio, completa el formulario y envía.</w:t>
       </w:r>
     </w:p>
     <w:p>
@@ -2560,7 +2573,7 @@
         <w:spacing w:after="90" w:line="288"/>
       </w:pPr>
       <w:r>
-        <w:t xml:space="preserve">Copia la Site Key (pública) y pégala en lib/manifest.js, campo turnstileSiteKey.</w:t>
+        <w:t xml:space="preserve">Debe aparecer el aviso verde “¡Mensaje recibido!” y llegar un correo con todos los datos. Si respondes a ese correo, la respuesta va directo al cliente.</w:t>
       </w:r>
     </w:p>
     <w:p>
@@ -2573,7 +2586,7 @@
         <w:spacing w:after="90" w:line="288"/>
       </w:pPr>
       <w:r>
-        <w:t xml:space="preserve">Copia la Secret Key y agrégala como secreto TURNSTILE_SECRET_KEY (sección 6.2). Vuelve a desplegar.</w:t>
+        <w:t xml:space="preserve">Si falla: Workers &amp; Pages → fuse → Deployments → View details → Functions → Real-time logs muestra el error exacto.</w:t>
       </w:r>
     </w:p>
     <w:p>
@@ -2581,68 +2594,7 @@
         <w:pStyle w:val="Heading2"/>
       </w:pPr>
       <w:r>
-        <w:t xml:space="preserve">6.5 Copia de seguridad de mensajes con KV (opcional)</w:t>
-      </w:r>
-    </w:p>
-    <w:p>
-      <w:pPr>
-        <w:spacing w:after="120" w:line="300"/>
-      </w:pPr>
-      <w:r>
-        <w:t xml:space="preserve">Cloudflare → Storage &amp; Databases → KV → Create namespace (ej. fuse-contact). Luego en Pages → Settings → Bindings → Add → KV namespace, nombre de variable CONTACT_KV. Así cada mensaje queda guardado un año y se limitan los envíos a 5 por hora por IP.</w:t>
-      </w:r>
-    </w:p>
-    <w:p>
-      <w:pPr>
-        <w:pStyle w:val="Heading1"/>
-        <w:pageBreakBefore/>
-      </w:pPr>
-      <w:r>
-        <w:t xml:space="preserve">7. Paso 5 — Agenda de reuniones con Google Calendar</w:t>
-      </w:r>
-    </w:p>
-    <w:p>
-      <w:pPr>
-        <w:spacing w:after="120" w:line="300"/>
-      </w:pPr>
-      <w:r>
-        <w:t xml:space="preserve">El botón “Agendar diagnóstico” (portada, recomendador, llamados finales y página de Contacto) abre un calendario donde el cliente elige día y hora. Hay dos modalidades: videollamada y presencial. Cada una es una “agenda de citas” distinta en Google Calendar.</w:t>
-      </w:r>
-    </w:p>
-    <w:p>
-      <w:pPr>
-        <w:spacing w:after="120" w:line="300"/>
-      </w:pPr>
-      <w:r>
-        <w:t xml:space="preserve">Además, debajo de las dos opciones aparece “¿Prefieres coordinar por WhatsApp?”, que abre un chat con un mensaje listo para pedir día y hora. Es la vía más cómoda para clientes con conexión inestable o donde Google Calendar/Meet no funciona bien. El texto del mensaje se cambia en lib/manifest.js → whatsappBookingMessage.</w:t>
-      </w:r>
-    </w:p>
-    <w:p>
-      <w:pPr>
-        <w:pBdr>
-          <w:left w:val="single" w:color="0057FF" w:sz="24" w:space="8"/>
-        </w:pBdr>
-        <w:shd w:fill="EEF3FF" w:val="clear"/>
-        <w:spacing w:after="160" w:before="120" w:line="288"/>
-      </w:pPr>
-      <w:r>
-        <w:rPr>
-          <w:b/>
-          <w:bCs/>
-          <w:color w:val="0057FF"/>
-        </w:rPr>
-        <w:t xml:space="preserve">Mientras no configures nada: </w:t>
-      </w:r>
-      <w:r>
-        <w:t xml:space="preserve">los botones llevan al formulario con la modalidad ya marcada (Videollamada o Presencial), así que no se pierde ningún contacto.</w:t>
-      </w:r>
-    </w:p>
-    <w:p>
-      <w:pPr>
-        <w:pStyle w:val="Heading2"/>
-      </w:pPr>
-      <w:r>
-        <w:t xml:space="preserve">7.1 Crear las dos agendas de citas</w:t>
+        <w:t xml:space="preserve">6.4 Anti-spam con Turnstile (recomendado)</w:t>
       </w:r>
     </w:p>
     <w:p>
@@ -2655,7 +2607,7 @@
         <w:spacing w:after="90" w:line="288"/>
       </w:pPr>
       <w:r>
-        <w:t xml:space="preserve">Entra a calendar.google.com con la cuenta que recibirá las reuniones.</w:t>
+        <w:t xml:space="preserve">Cloudflare → Turnstile → Add widget. Nombre: FUSE web · Hostnames: tu dominio y fuse.pages.dev · Modo: Managed.</w:t>
       </w:r>
     </w:p>
     <w:p>
@@ -2668,7 +2620,7 @@
         <w:spacing w:after="90" w:line="288"/>
       </w:pPr>
       <w:r>
-        <w:t xml:space="preserve">Pulsa Crear → Agenda de citas (Appointment schedule).</w:t>
+        <w:t xml:space="preserve">Copia la Site Key (pública) y pégala en lib/manifest.js, campo turnstileSiteKey.</w:t>
       </w:r>
     </w:p>
     <w:p>
@@ -2681,53 +2633,68 @@
         <w:spacing w:after="90" w:line="288"/>
       </w:pPr>
       <w:r>
-        <w:t xml:space="preserve">Título: “Diagnóstico FUSE — Videollamada”. Define la duración (ej. 30 min), los días y horarios disponibles y el margen entre citas.</w:t>
-      </w:r>
-    </w:p>
-    <w:p>
-      <w:pPr>
-        <w:pStyle w:val="ListParagraph"/>
-        <w:numPr>
-          <w:ilvl w:val="0"/>
-          <w:numId w:val="10"/>
-        </w:numPr>
-        <w:spacing w:after="90" w:line="288"/>
-      </w:pPr>
-      <w:r>
-        <w:t xml:space="preserve">En “Ubicación y conferencias” elige Google Meet. Guarda.</w:t>
-      </w:r>
-    </w:p>
-    <w:p>
-      <w:pPr>
-        <w:pStyle w:val="ListParagraph"/>
-        <w:numPr>
-          <w:ilvl w:val="0"/>
-          <w:numId w:val="10"/>
-        </w:numPr>
-        <w:spacing w:after="90" w:line="288"/>
-      </w:pPr>
-      <w:r>
-        <w:t xml:space="preserve">Repite para “Diagnóstico FUSE — Presencial”: en Ubicación elige “En persona” y escribe la dirección (o “En el negocio del cliente”). Guarda.</w:t>
+        <w:t xml:space="preserve">Copia la Secret Key y agrégala como secreto TURNSTILE_SECRET_KEY (sección 6.2). Vuelve a desplegar.</w:t>
+      </w:r>
+    </w:p>
+    <w:p>
+      <w:pPr>
+        <w:pStyle w:val="Heading2"/>
+      </w:pPr>
+      <w:r>
+        <w:t xml:space="preserve">6.5 Copia de seguridad de mensajes con KV (opcional)</w:t>
+      </w:r>
+    </w:p>
+    <w:p>
+      <w:pPr>
+        <w:spacing w:after="120" w:line="300"/>
+      </w:pPr>
+      <w:r>
+        <w:t xml:space="preserve">Cloudflare → Storage &amp; Databases → KV → Create namespace (ej. fuse-contact). Luego en Pages → Settings → Bindings → Add → KV namespace, nombre de variable CONTACT_KV. Así cada mensaje queda guardado un año y se limitan los envíos a 5 por hora por IP.</w:t>
+      </w:r>
+    </w:p>
+    <w:p>
+      <w:pPr>
+        <w:pStyle w:val="Heading1"/>
+        <w:pageBreakBefore/>
+      </w:pPr>
+      <w:r>
+        <w:t xml:space="preserve">7. Paso 5 — Agenda de reuniones con Google Calendar</w:t>
+      </w:r>
+    </w:p>
+    <w:p>
+      <w:pPr>
+        <w:spacing w:after="120" w:line="300"/>
+      </w:pPr>
+      <w:r>
+        <w:t xml:space="preserve">El botón “Agendar diagnóstico” (portada, recomendador, llamados finales y página de Contacto) abre un calendario donde el cliente elige día y hora. Hay dos modalidades: videollamada y presencial. Cada una es una “agenda de citas” distinta en Google Calendar.</w:t>
+      </w:r>
+    </w:p>
+    <w:p>
+      <w:pPr>
+        <w:spacing w:after="120" w:line="300"/>
+      </w:pPr>
+      <w:r>
+        <w:t xml:space="preserve">Además, debajo de las dos opciones aparece “¿Prefieres coordinar por WhatsApp?”, que abre un chat con un mensaje listo para pedir día y hora. Es la vía más cómoda para clientes con conexión inestable o donde Google Calendar/Meet no funciona bien. El texto del mensaje se cambia en lib/manifest.js → whatsappBookingMessage.</w:t>
       </w:r>
     </w:p>
     <w:p>
       <w:pPr>
         <w:pBdr>
-          <w:left w:val="single" w:color="FF7A00" w:sz="24" w:space="8"/>
+          <w:left w:val="single" w:color="0057FF" w:sz="24" w:space="8"/>
         </w:pBdr>
-        <w:shd w:fill="FFF4EA" w:val="clear"/>
+        <w:shd w:fill="EEF3FF" w:val="clear"/>
         <w:spacing w:after="160" w:before="120" w:line="288"/>
       </w:pPr>
       <w:r>
         <w:rPr>
           <w:b/>
           <w:bCs/>
-          <w:color w:val="FF7A00"/>
-        </w:rPr>
-        <w:t xml:space="preserve">Cuenta de Google: </w:t>
-      </w:r>
-      <w:r>
-        <w:t xml:space="preserve">con Gmail gratuito se pueden crear agendas de citas con funciones básicas. Algunas opciones avanzadas (varias agendas, recordatorios por correo, pedir verificación al cliente) pueden requerir Google Workspace o Google One Premium; si al crear la segunda agenda Google lo pide, usa una sola agenda y en su descripción indica que la reunión puede ser virtual o presencial.</w:t>
+          <w:color w:val="0057FF"/>
+        </w:rPr>
+        <w:t xml:space="preserve">Mientras no configures nada: </w:t>
+      </w:r>
+      <w:r>
+        <w:t xml:space="preserve">los botones llevan al formulario con la modalidad ya marcada (Videollamada o Presencial), así que no se pierde ningún contacto.</w:t>
       </w:r>
     </w:p>
     <w:p>
@@ -2735,7 +2702,7 @@
         <w:pStyle w:val="Heading2"/>
       </w:pPr>
       <w:r>
-        <w:t xml:space="preserve">7.2 Copiar el enlace correcto</w:t>
+        <w:t xml:space="preserve">7.1 Crear las dos agendas de citas</w:t>
       </w:r>
     </w:p>
     <w:p>
@@ -2748,7 +2715,7 @@
         <w:spacing w:after="90" w:line="288"/>
       </w:pPr>
       <w:r>
-        <w:t xml:space="preserve">Abre la agenda de citas en tu calendario y pulsa Compartir (Share).</w:t>
+        <w:t xml:space="preserve">Entra a calendar.google.com con la cuenta que recibirá las reuniones.</w:t>
       </w:r>
     </w:p>
     <w:p>
@@ -2761,7 +2728,7 @@
         <w:spacing w:after="90" w:line="288"/>
       </w:pPr>
       <w:r>
-        <w:t xml:space="preserve">Elige “Insertar en el sitio web” (Website embed) → “Calendario de citas en línea” (Inline).</w:t>
+        <w:t xml:space="preserve">Pulsa Crear → Agenda de citas (Appointment schedule).</w:t>
       </w:r>
     </w:p>
     <w:p>
@@ -2774,7 +2741,33 @@
         <w:spacing w:after="90" w:line="288"/>
       </w:pPr>
       <w:r>
-        <w:t xml:space="preserve">Del código que aparece copia solo la dirección que va entre comillas después de src=, que empieza con https://calendar.google.com/calendar/appointments/schedules/… y termina en ?gv=true.</w:t>
+        <w:t xml:space="preserve">Título: “Diagnóstico FUSE — Videollamada”. Define la duración (ej. 30 min), los días y horarios disponibles y el margen entre citas.</w:t>
+      </w:r>
+    </w:p>
+    <w:p>
+      <w:pPr>
+        <w:pStyle w:val="ListParagraph"/>
+        <w:numPr>
+          <w:ilvl w:val="0"/>
+          <w:numId w:val="11"/>
+        </w:numPr>
+        <w:spacing w:after="90" w:line="288"/>
+      </w:pPr>
+      <w:r>
+        <w:t xml:space="preserve">En “Ubicación y conferencias” elige Google Meet. Guarda.</w:t>
+      </w:r>
+    </w:p>
+    <w:p>
+      <w:pPr>
+        <w:pStyle w:val="ListParagraph"/>
+        <w:numPr>
+          <w:ilvl w:val="0"/>
+          <w:numId w:val="11"/>
+        </w:numPr>
+        <w:spacing w:after="90" w:line="288"/>
+      </w:pPr>
+      <w:r>
+        <w:t xml:space="preserve">Repite para “Diagnóstico FUSE — Presencial”: en Ubicación elige “En persona” y escribe la dirección (o “En el negocio del cliente”). Guarda.</w:t>
       </w:r>
     </w:p>
     <w:p>
@@ -2791,10 +2784,10 @@
           <w:bCs/>
           <w:color w:val="FF7A00"/>
         </w:rPr>
-        <w:t xml:space="preserve">Ojo: </w:t>
-      </w:r>
-      <w:r>
-        <w:t xml:space="preserve">el enlace corto (calendar.app.google/…) también funciona, pero en ese caso el calendario se abre en una pestaña nueva en lugar de dentro del sitio. Para verlo integrado usa el enlace largo.</w:t>
+        <w:t xml:space="preserve">Cuenta de Google: </w:t>
+      </w:r>
+      <w:r>
+        <w:t xml:space="preserve">con Gmail gratuito se pueden crear agendas de citas con funciones básicas. Algunas opciones avanzadas (varias agendas, recordatorios por correo, pedir verificación al cliente) pueden requerir Google Workspace o Google One Premium; si al crear la segunda agenda Google lo pide, usa una sola agenda y en su descripción indica que la reunión puede ser virtual o presencial.</w:t>
       </w:r>
     </w:p>
     <w:p>
@@ -2802,145 +2795,7 @@
         <w:pStyle w:val="Heading2"/>
       </w:pPr>
       <w:r>
-        <w:t xml:space="preserve">7.3 Pegarlo en el sitio</w:t>
-      </w:r>
-    </w:p>
-    <w:p>
-      <w:pPr>
-        <w:spacing w:after="120" w:line="300"/>
-      </w:pPr>
-      <w:r>
-        <w:t xml:space="preserve">En lib/manifest.js, sección booking:</w:t>
-      </w:r>
-    </w:p>
-    <w:p>
-      <w:pPr>
-        <w:pBdr>
-          <w:left w:val="single" w:color="0057FF" w:sz="18" w:space="6"/>
-        </w:pBdr>
-        <w:shd w:fill="F2F4F8" w:val="clear"/>
-        <w:spacing w:after="120"/>
-      </w:pPr>
-      <w:r>
-        <w:rPr>
-          <w:rFonts w:ascii="Consolas" w:cs="Consolas" w:eastAsia="Consolas" w:hAnsi="Consolas"/>
-          <w:sz w:val="19"/>
-          <w:szCs w:val="19"/>
-        </w:rPr>
-        <w:t xml:space="preserve">booking: {</w:t>
-      </w:r>
-      <w:r>
-        <w:br/>
-      </w:r>
-      <w:r>
-        <w:rPr>
-          <w:rFonts w:ascii="Consolas" w:cs="Consolas" w:eastAsia="Consolas" w:hAnsi="Consolas"/>
-          <w:sz w:val="19"/>
-          <w:szCs w:val="19"/>
-        </w:rPr>
-        <w:t xml:space="preserve">  virtualUrl: "https://calendar.google.com/calendar/appointments/schedules/AAAA…?gv=true",</w:t>
-      </w:r>
-      <w:r>
-        <w:br/>
-      </w:r>
-      <w:r>
-        <w:rPr>
-          <w:rFonts w:ascii="Consolas" w:cs="Consolas" w:eastAsia="Consolas" w:hAnsi="Consolas"/>
-          <w:sz w:val="19"/>
-          <w:szCs w:val="19"/>
-        </w:rPr>
-        <w:t xml:space="preserve">  presencialUrl: "https://calendar.google.com/calendar/appointments/schedules/BBBB…?gv=true",</w:t>
-      </w:r>
-      <w:r>
-        <w:br/>
-      </w:r>
-      <w:r>
-        <w:rPr>
-          <w:rFonts w:ascii="Consolas" w:cs="Consolas" w:eastAsia="Consolas" w:hAnsi="Consolas"/>
-          <w:sz w:val="19"/>
-          <w:szCs w:val="19"/>
-        </w:rPr>
-        <w:t xml:space="preserve">  ...</w:t>
-      </w:r>
-      <w:r>
-        <w:br/>
-      </w:r>
-      <w:r>
-        <w:rPr>
-          <w:rFonts w:ascii="Consolas" w:cs="Consolas" w:eastAsia="Consolas" w:hAnsi="Consolas"/>
-          <w:sz w:val="19"/>
-          <w:szCs w:val="19"/>
-        </w:rPr>
-        <w:t xml:space="preserve">}</w:t>
-      </w:r>
-    </w:p>
-    <w:p>
-      <w:pPr>
-        <w:spacing w:after="120" w:line="300"/>
-      </w:pPr>
-      <w:r>
-        <w:t xml:space="preserve">Si solo tienes una agenda, llena solo virtualUrl: el selector de modalidad se oculta automáticamente. Opcional: completa contact.meetAddress con la dirección de tus reuniones presenciales para mostrarla en Contacto.</w:t>
-      </w:r>
-    </w:p>
-    <w:p>
-      <w:pPr>
-        <w:spacing w:after="120" w:line="300"/>
-      </w:pPr>
-      <w:r>
-        <w:t xml:space="preserve">Guarda el cambio (commit) y en uno o dos minutos el calendario aparece en el sitio. Cada reserva llega a tu Google Calendar con aviso por correo y, si es virtual, con el enlace de Meet.</w:t>
-      </w:r>
-    </w:p>
-    <w:p>
-      <w:pPr>
-        <w:pStyle w:val="Heading1"/>
-        <w:pageBreakBefore/>
-      </w:pPr>
-      <w:r>
-        <w:t xml:space="preserve">8. Paso 6 — Analítica y posicionamiento</w:t>
-      </w:r>
-    </w:p>
-    <w:p>
-      <w:pPr>
-        <w:pStyle w:val="Heading2"/>
-      </w:pPr>
-      <w:r>
-        <w:t xml:space="preserve">8.1 Cloudflare Web Analytics (sin cookies)</w:t>
-      </w:r>
-    </w:p>
-    <w:p>
-      <w:pPr>
-        <w:spacing w:after="120" w:line="300"/>
-      </w:pPr>
-      <w:r>
-        <w:t xml:space="preserve">Pages → fuse → Metrics → Web Analytics → Enable. No usa cookies, por lo que no necesitas banner de consentimiento. Verás visitas, páginas más vistas, países y rendimiento (Core Web Vitals).</w:t>
-      </w:r>
-    </w:p>
-    <w:p>
-      <w:pPr>
-        <w:pBdr>
-          <w:left w:val="single" w:color="0057FF" w:sz="24" w:space="8"/>
-        </w:pBdr>
-        <w:shd w:fill="EEF3FF" w:val="clear"/>
-        <w:spacing w:after="160" w:before="120" w:line="288"/>
-      </w:pPr>
-      <w:r>
-        <w:rPr>
-          <w:b/>
-          <w:bCs/>
-          <w:color w:val="0057FF"/>
-        </w:rPr>
-        <w:t xml:space="preserve">Si más adelante agregas Google Analytics 4 o Meta Pixel: </w:t>
-      </w:r>
-      <w:r>
-        <w:t xml:space="preserve">habrá que añadir sus dominios a la política de seguridad en _headers (Content-Security-Policy), un banner de cookies y actualizar la política de privacidad.</w:t>
-      </w:r>
-    </w:p>
-    <w:p>
-      <w:pPr>
-        <w:pStyle w:val="Heading2"/>
-      </w:pPr>
-      <w:r>
-        <w:t xml:space="preserve">8.2 Google Search Console</w:t>
+        <w:t xml:space="preserve">7.2 Copiar el enlace correcto</w:t>
       </w:r>
     </w:p>
     <w:p>
@@ -2953,7 +2808,7 @@
         <w:spacing w:after="90" w:line="288"/>
       </w:pPr>
       <w:r>
-        <w:t xml:space="preserve">search.google.com/search-console → Agregar propiedad → Dominio → fuseconsultora.com.</w:t>
+        <w:t xml:space="preserve">Abre la agenda de citas en tu calendario y pulsa Compartir (Share).</w:t>
       </w:r>
     </w:p>
     <w:p>
@@ -2966,7 +2821,7 @@
         <w:spacing w:after="90" w:line="288"/>
       </w:pPr>
       <w:r>
-        <w:t xml:space="preserve">Google te da un registro TXT: agrégalo en Cloudflare → DNS y verifica.</w:t>
+        <w:t xml:space="preserve">Elige “Insertar en el sitio web” (Website embed) → “Calendario de citas en línea” (Inline).</w:t>
       </w:r>
     </w:p>
     <w:p>
@@ -2975,6 +2830,211 @@
         <w:numPr>
           <w:ilvl w:val="0"/>
           <w:numId w:val="12"/>
+        </w:numPr>
+        <w:spacing w:after="90" w:line="288"/>
+      </w:pPr>
+      <w:r>
+        <w:t xml:space="preserve">Del código que aparece copia solo la dirección que va entre comillas después de src=, que empieza con https://calendar.google.com/calendar/appointments/schedules/… y termina en ?gv=true.</w:t>
+      </w:r>
+    </w:p>
+    <w:p>
+      <w:pPr>
+        <w:pBdr>
+          <w:left w:val="single" w:color="FF7A00" w:sz="24" w:space="8"/>
+        </w:pBdr>
+        <w:shd w:fill="FFF4EA" w:val="clear"/>
+        <w:spacing w:after="160" w:before="120" w:line="288"/>
+      </w:pPr>
+      <w:r>
+        <w:rPr>
+          <w:b/>
+          <w:bCs/>
+          <w:color w:val="FF7A00"/>
+        </w:rPr>
+        <w:t xml:space="preserve">Ojo: </w:t>
+      </w:r>
+      <w:r>
+        <w:t xml:space="preserve">el enlace corto (calendar.app.google/…) también funciona, pero en ese caso el calendario se abre en una pestaña nueva en lugar de dentro del sitio. Para verlo integrado usa el enlace largo.</w:t>
+      </w:r>
+    </w:p>
+    <w:p>
+      <w:pPr>
+        <w:pStyle w:val="Heading2"/>
+      </w:pPr>
+      <w:r>
+        <w:t xml:space="preserve">7.3 Pegarlo en el sitio</w:t>
+      </w:r>
+    </w:p>
+    <w:p>
+      <w:pPr>
+        <w:spacing w:after="120" w:line="300"/>
+      </w:pPr>
+      <w:r>
+        <w:t xml:space="preserve">En lib/manifest.js, sección booking:</w:t>
+      </w:r>
+    </w:p>
+    <w:p>
+      <w:pPr>
+        <w:pBdr>
+          <w:left w:val="single" w:color="0057FF" w:sz="18" w:space="6"/>
+        </w:pBdr>
+        <w:shd w:fill="F2F4F8" w:val="clear"/>
+        <w:spacing w:after="120"/>
+      </w:pPr>
+      <w:r>
+        <w:rPr>
+          <w:rFonts w:ascii="Consolas" w:cs="Consolas" w:eastAsia="Consolas" w:hAnsi="Consolas"/>
+          <w:sz w:val="19"/>
+          <w:szCs w:val="19"/>
+        </w:rPr>
+        <w:t xml:space="preserve">booking: {</w:t>
+      </w:r>
+      <w:r>
+        <w:br/>
+      </w:r>
+      <w:r>
+        <w:rPr>
+          <w:rFonts w:ascii="Consolas" w:cs="Consolas" w:eastAsia="Consolas" w:hAnsi="Consolas"/>
+          <w:sz w:val="19"/>
+          <w:szCs w:val="19"/>
+        </w:rPr>
+        <w:t xml:space="preserve">  virtualUrl: "https://calendar.google.com/calendar/appointments/schedules/AAAA…?gv=true",</w:t>
+      </w:r>
+      <w:r>
+        <w:br/>
+      </w:r>
+      <w:r>
+        <w:rPr>
+          <w:rFonts w:ascii="Consolas" w:cs="Consolas" w:eastAsia="Consolas" w:hAnsi="Consolas"/>
+          <w:sz w:val="19"/>
+          <w:szCs w:val="19"/>
+        </w:rPr>
+        <w:t xml:space="preserve">  presencialUrl: "https://calendar.google.com/calendar/appointments/schedules/BBBB…?gv=true",</w:t>
+      </w:r>
+      <w:r>
+        <w:br/>
+      </w:r>
+      <w:r>
+        <w:rPr>
+          <w:rFonts w:ascii="Consolas" w:cs="Consolas" w:eastAsia="Consolas" w:hAnsi="Consolas"/>
+          <w:sz w:val="19"/>
+          <w:szCs w:val="19"/>
+        </w:rPr>
+        <w:t xml:space="preserve">  ...</w:t>
+      </w:r>
+      <w:r>
+        <w:br/>
+      </w:r>
+      <w:r>
+        <w:rPr>
+          <w:rFonts w:ascii="Consolas" w:cs="Consolas" w:eastAsia="Consolas" w:hAnsi="Consolas"/>
+          <w:sz w:val="19"/>
+          <w:szCs w:val="19"/>
+        </w:rPr>
+        <w:t xml:space="preserve">}</w:t>
+      </w:r>
+    </w:p>
+    <w:p>
+      <w:pPr>
+        <w:spacing w:after="120" w:line="300"/>
+      </w:pPr>
+      <w:r>
+        <w:t xml:space="preserve">Si solo tienes una agenda, llena solo virtualUrl: el selector de modalidad se oculta automáticamente. Opcional: completa contact.meetAddress con la dirección de tus reuniones presenciales para mostrarla en Contacto.</w:t>
+      </w:r>
+    </w:p>
+    <w:p>
+      <w:pPr>
+        <w:spacing w:after="120" w:line="300"/>
+      </w:pPr>
+      <w:r>
+        <w:t xml:space="preserve">Guarda el cambio (commit) y en uno o dos minutos el calendario aparece en el sitio. Cada reserva llega a tu Google Calendar con aviso por correo y, si es virtual, con el enlace de Meet.</w:t>
+      </w:r>
+    </w:p>
+    <w:p>
+      <w:pPr>
+        <w:pStyle w:val="Heading1"/>
+        <w:pageBreakBefore/>
+      </w:pPr>
+      <w:r>
+        <w:t xml:space="preserve">8. Paso 6 — Analítica y posicionamiento</w:t>
+      </w:r>
+    </w:p>
+    <w:p>
+      <w:pPr>
+        <w:pStyle w:val="Heading2"/>
+      </w:pPr>
+      <w:r>
+        <w:t xml:space="preserve">8.1 Cloudflare Web Analytics (sin cookies)</w:t>
+      </w:r>
+    </w:p>
+    <w:p>
+      <w:pPr>
+        <w:spacing w:after="120" w:line="300"/>
+      </w:pPr>
+      <w:r>
+        <w:t xml:space="preserve">Pages → fuse → Metrics → Web Analytics → Enable. No usa cookies, por lo que no necesitas banner de consentimiento. Verás visitas, páginas más vistas, países y rendimiento (Core Web Vitals).</w:t>
+      </w:r>
+    </w:p>
+    <w:p>
+      <w:pPr>
+        <w:pBdr>
+          <w:left w:val="single" w:color="0057FF" w:sz="24" w:space="8"/>
+        </w:pBdr>
+        <w:shd w:fill="EEF3FF" w:val="clear"/>
+        <w:spacing w:after="160" w:before="120" w:line="288"/>
+      </w:pPr>
+      <w:r>
+        <w:rPr>
+          <w:b/>
+          <w:bCs/>
+          <w:color w:val="0057FF"/>
+        </w:rPr>
+        <w:t xml:space="preserve">Si más adelante agregas Google Analytics 4 o Meta Pixel: </w:t>
+      </w:r>
+      <w:r>
+        <w:t xml:space="preserve">habrá que añadir sus dominios a la política de seguridad en _headers (Content-Security-Policy), un banner de cookies y actualizar la política de privacidad.</w:t>
+      </w:r>
+    </w:p>
+    <w:p>
+      <w:pPr>
+        <w:pStyle w:val="Heading2"/>
+      </w:pPr>
+      <w:r>
+        <w:t xml:space="preserve">8.2 Google Search Console</w:t>
+      </w:r>
+    </w:p>
+    <w:p>
+      <w:pPr>
+        <w:pStyle w:val="ListParagraph"/>
+        <w:numPr>
+          <w:ilvl w:val="0"/>
+          <w:numId w:val="13"/>
+        </w:numPr>
+        <w:spacing w:after="90" w:line="288"/>
+      </w:pPr>
+      <w:r>
+        <w:t xml:space="preserve">search.google.com/search-console → Agregar propiedad → Dominio → fuseconsultora.com.</w:t>
+      </w:r>
+    </w:p>
+    <w:p>
+      <w:pPr>
+        <w:pStyle w:val="ListParagraph"/>
+        <w:numPr>
+          <w:ilvl w:val="0"/>
+          <w:numId w:val="13"/>
+        </w:numPr>
+        <w:spacing w:after="90" w:line="288"/>
+      </w:pPr>
+      <w:r>
+        <w:t xml:space="preserve">Google te da un registro TXT: agrégalo en Cloudflare → DNS y verifica.</w:t>
+      </w:r>
+    </w:p>
+    <w:p>
+      <w:pPr>
+        <w:pStyle w:val="ListParagraph"/>
+        <w:numPr>
+          <w:ilvl w:val="0"/>
+          <w:numId w:val="13"/>
         </w:numPr>
         <w:spacing w:after="90" w:line="288"/>
       </w:pPr>
@@ -3323,7 +3383,7 @@
                 <w:sz w:val="19"/>
                 <w:szCs w:val="19"/>
               </w:rPr>
-              <w:t xml:space="preserve">Testimonios</w:t>
+              <w:t xml:space="preserve">Testimonios (hoy ocultos)</w:t>
             </w:r>
           </w:p>
         </w:tc>
@@ -3353,7 +3413,7 @@
                 <w:sz w:val="19"/>
                 <w:szCs w:val="19"/>
               </w:rPr>
-              <w:t xml:space="preserve">index.html → sección TESTIMONIOS: cambia texto, nombre, rol y quita el badge “Ejemplo”</w:t>
+              <w:t xml:space="preserve">index.html → sección TESTIMONIOS: escribe las reseñas reales, quita el badge “Ejemplo” y borra el atributo hidden de &lt;section id="testimonios"&gt;</w:t>
             </w:r>
           </w:p>
         </w:tc>
@@ -3739,7 +3799,7 @@
           <w:sz w:val="19"/>
           <w:szCs w:val="19"/>
         </w:rPr>
-        <w:t xml:space="preserve">  email: "hola@fuseconsultora.com",</w:t>
+        <w:t xml:space="preserve">  email: "",                          // vacío = oculto (ver sección 6.0)</w:t>
       </w:r>
       <w:r>
         <w:br/>
@@ -4588,7 +4648,7 @@
                 <w:sz w:val="19"/>
                 <w:szCs w:val="19"/>
               </w:rPr>
-              <w:t xml:space="preserve">Testimonios de ejemplo reemplazados u ocultos</w:t>
+              <w:t xml:space="preserve">Email definido (sección 6.0) o decisión consciente de usar solo WhatsApp</w:t>
             </w:r>
           </w:p>
         </w:tc>
@@ -4651,7 +4711,7 @@
                 <w:sz w:val="19"/>
                 <w:szCs w:val="19"/>
               </w:rPr>
-              <w:t xml:space="preserve">Logo definitivo en alta resolución</w:t>
+              <w:t xml:space="preserve">Testimonios: hoy ocultos; mostrarlos cuando haya reseñas reales (quitar hidden en index.html)</w:t>
             </w:r>
           </w:p>
         </w:tc>
@@ -4716,7 +4776,7 @@
                 <w:sz w:val="19"/>
                 <w:szCs w:val="19"/>
               </w:rPr>
-              <w:t xml:space="preserve">Política de privacidad revisada por un abogado</w:t>
+              <w:t xml:space="preserve">Logo definitivo en alta resolución</w:t>
             </w:r>
           </w:p>
         </w:tc>
@@ -4779,7 +4839,7 @@
                 <w:sz w:val="19"/>
                 <w:szCs w:val="19"/>
               </w:rPr>
-              <w:t xml:space="preserve">Web Analytics activado y sitemap enviado a Google Search Console</w:t>
+              <w:t xml:space="preserve">Política de privacidad revisada por un abogado</w:t>
             </w:r>
           </w:p>
         </w:tc>
@@ -4844,7 +4904,7 @@
                 <w:sz w:val="19"/>
                 <w:szCs w:val="19"/>
               </w:rPr>
-              <w:t xml:space="preserve">Prueba en celular: menú, formulario, WhatsApp y recomendador</w:t>
+              <w:t xml:space="preserve">Web Analytics activado y sitemap enviado a Google Search Console</w:t>
             </w:r>
           </w:p>
         </w:tc>
@@ -4891,6 +4951,71 @@
               <w:bottom w:val="single" w:color="D5DAE3" w:sz="4"/>
               <w:right w:val="single" w:color="D5DAE3" w:sz="4"/>
             </w:tcBorders>
+            <w:tcMar>
+              <w:top w:type="dxa" w:w="80"/>
+              <w:left w:type="dxa" w:w="110"/>
+              <w:bottom w:type="dxa" w:w="80"/>
+              <w:right w:type="dxa" w:w="110"/>
+            </w:tcMar>
+          </w:tcPr>
+          <w:p>
+            <w:pPr>
+              <w:spacing w:after="0" w:line="264"/>
+            </w:pPr>
+            <w:r>
+              <w:rPr>
+                <w:sz w:val="19"/>
+                <w:szCs w:val="19"/>
+              </w:rPr>
+              <w:t xml:space="preserve">Prueba en celular: menú, formulario, WhatsApp y recomendador</w:t>
+            </w:r>
+          </w:p>
+        </w:tc>
+      </w:tr>
+      <w:tr>
+        <w:trPr>
+          <w:tblHeader w:val="false"/>
+        </w:trPr>
+        <w:tc>
+          <w:tcPr>
+            <w:tcW w:type="dxa" w:w="600"/>
+            <w:tcBorders>
+              <w:top w:val="single" w:color="D5DAE3" w:sz="4"/>
+              <w:left w:val="single" w:color="D5DAE3" w:sz="4"/>
+              <w:bottom w:val="single" w:color="D5DAE3" w:sz="4"/>
+              <w:right w:val="single" w:color="D5DAE3" w:sz="4"/>
+            </w:tcBorders>
+            <w:shd w:fill="F7F8FB" w:val="clear"/>
+            <w:tcMar>
+              <w:top w:type="dxa" w:w="80"/>
+              <w:left w:type="dxa" w:w="110"/>
+              <w:bottom w:type="dxa" w:w="80"/>
+              <w:right w:type="dxa" w:w="110"/>
+            </w:tcMar>
+          </w:tcPr>
+          <w:p>
+            <w:pPr>
+              <w:spacing w:after="0" w:line="264"/>
+            </w:pPr>
+            <w:r>
+              <w:rPr>
+                <w:sz w:val="19"/>
+                <w:szCs w:val="19"/>
+              </w:rPr>
+              <w:t xml:space="preserve">☐</w:t>
+            </w:r>
+          </w:p>
+        </w:tc>
+        <w:tc>
+          <w:tcPr>
+            <w:tcW w:type="dxa" w:w="8426"/>
+            <w:tcBorders>
+              <w:top w:val="single" w:color="D5DAE3" w:sz="4"/>
+              <w:left w:val="single" w:color="D5DAE3" w:sz="4"/>
+              <w:bottom w:val="single" w:color="D5DAE3" w:sz="4"/>
+              <w:right w:val="single" w:color="D5DAE3" w:sz="4"/>
+            </w:tcBorders>
+            <w:shd w:fill="F7F8FB" w:val="clear"/>
             <w:tcMar>
               <w:top w:type="dxa" w:w="80"/>
               <w:left w:type="dxa" w:w="110"/>
@@ -5102,7 +5227,7 @@
                 <w:sz w:val="19"/>
                 <w:szCs w:val="19"/>
               </w:rPr>
-              <w:t xml:space="preserve">El formulario abre el programa de correo</w:t>
+              <w:t xml:space="preserve">El formulario abre WhatsApp o el correo en vez de mostrar “¡Mensaje recibido!”</w:t>
             </w:r>
           </w:p>
         </w:tc>
@@ -5132,7 +5257,7 @@
                 <w:sz w:val="19"/>
                 <w:szCs w:val="19"/>
               </w:rPr>
-              <w:t xml:space="preserve">Faltan RESEND_API_KEY o el redeploy tras cargar variables (sección 6.2).</w:t>
+              <w:t xml:space="preserve">Es el plan B: faltan RESEND_API_KEY o CONTACT_TO, o no se volvió a desplegar tras cargarlas (sección 6.2).</w:t>
             </w:r>
           </w:p>
         </w:tc>
@@ -5619,7 +5744,7 @@
         <w:t xml:space="preserve">3. </w:t>
       </w:r>
       <w:r>
-        <w:t xml:space="preserve">¿Cuál es el email real que recibirá los contactos y quién responde las consultas?</w:t>
+        <w:t xml:space="preserve">¿Cuándo activamos el email del sitio y quién responderá las consultas?</w:t>
       </w:r>
     </w:p>
     <w:p>
@@ -5801,7 +5926,7 @@
         <w:t xml:space="preserve">9. </w:t>
       </w:r>
       <w:r>
-        <w:t xml:space="preserve">¿Tienes reseñas en Google, Facebook o LinkedIn que podamos mostrar en lugar de los testimonios de ejemplo?</w:t>
+        <w:t xml:space="preserve">¿Tienes reseñas en Google o Instagram para activar la sección de testimonios (hoy oculta)?</w:t>
       </w:r>
     </w:p>
     <w:p>
@@ -7372,6 +7497,12 @@
   </w:num>
   <w:num w:numId="12">
     <w:abstractNumId w:val="12"/>
+    <w:lvlOverride w:ilvl="0">
+      <w:startOverride w:val="1"/>
+    </w:lvlOverride>
+  </w:num>
+  <w:num w:numId="13">
+    <w:abstractNumId w:val="13"/>
     <w:lvlOverride w:ilvl="0">
       <w:startOverride w:val="1"/>
     </w:lvlOverride>

</xml_diff>